<commit_message>
Improve QR meme Word sheets: readable text, 6 and 8 per A4 page.
Larger fonts, tighter single-page layout without header overflow, and two printable versions.

Co-authored-by: AlisherXasanov <AlisherXasanov@users.noreply.github.com>
</commit_message>
<xml_diff>
--- a/docs/qr-memes-6-per-page.docx
+++ b/docs/qr-memes-6-per-page.docx
@@ -2,104 +2,88 @@
 <file path=word/document.xml><?xml version="1.0" encoding="utf-8"?>
 <w:document xmlns:wpc="http://schemas.microsoft.com/office/word/2010/wordprocessingCanvas" xmlns:mo="http://schemas.microsoft.com/office/mac/office/2008/main" xmlns:mc="http://schemas.openxmlformats.org/markup-compatibility/2006" xmlns:mv="urn:schemas-microsoft-com:mac:vml" xmlns:o="urn:schemas-microsoft-com:office:office" xmlns:r="http://schemas.openxmlformats.org/officeDocument/2006/relationships" xmlns:m="http://schemas.openxmlformats.org/officeDocument/2006/math" xmlns:v="urn:schemas-microsoft-com:vml" xmlns:wp14="http://schemas.microsoft.com/office/word/2010/wordprocessingDrawing" xmlns:wp="http://schemas.openxmlformats.org/drawingml/2006/wordprocessingDrawing" xmlns:w10="urn:schemas-microsoft-com:office:word" xmlns:w="http://schemas.openxmlformats.org/wordprocessingml/2006/main" xmlns:w14="http://schemas.microsoft.com/office/word/2010/wordml" xmlns:wpg="http://schemas.microsoft.com/office/word/2010/wordprocessingGroup" xmlns:wpi="http://schemas.microsoft.com/office/word/2010/wordprocessingInk" xmlns:wne="http://schemas.microsoft.com/office/word/2006/wordml" xmlns:wps="http://schemas.microsoft.com/office/word/2010/wordprocessingShape" mc:Ignorable="w14 wp14">
   <w:body>
-    <w:p>
-      <w:pPr>
-        <w:jc w:val="center"/>
-      </w:pPr>
-      <w:r>
-        <w:rPr>
-          <w:b/>
-          <w:sz w:val="22"/>
-        </w:rPr>
-        <w:t>QR · Мемы Амаля — лист для печати (6 наклеек на странице)</w:t>
-      </w:r>
-    </w:p>
-    <w:p>
-      <w:pPr>
-        <w:jc w:val="center"/>
-      </w:pPr>
-      <w:r>
-        <w:rPr>
-          <w:color w:val="64748B"/>
-          <w:sz w:val="16"/>
-        </w:rPr>
-        <w:t>Источник: https://alisherxasanov.github.io/amal-games/qr-memes.html?print=1</w:t>
-      </w:r>
-    </w:p>
-    <w:p/>
     <w:tbl>
       <w:tblPr>
         <w:tblW w:type="auto" w:w="0"/>
         <w:jc w:val="center"/>
+        <w:tblLook w:firstColumn="1" w:firstRow="1" w:lastColumn="0" w:lastRow="0" w:noHBand="0" w:noVBand="1" w:val="04A0"/>
         <w:tblLayout w:type="fixed"/>
-        <w:tblLook w:firstColumn="1" w:firstRow="1" w:lastColumn="0" w:lastRow="0" w:noHBand="0" w:noVBand="1" w:val="04A0"/>
       </w:tblPr>
       <w:tblGrid>
-        <w:gridCol w:w="5499"/>
-        <w:gridCol w:w="5499"/>
+        <w:gridCol w:w="5698"/>
+        <w:gridCol w:w="5698"/>
       </w:tblGrid>
       <w:tr>
         <w:trPr>
-          <w:trHeight w:val="4989"/>
+          <w:cantSplit/>
+          <w:trHeight w:val="5301"/>
         </w:trPr>
         <w:tc>
           <w:tcPr>
-            <w:tcW w:type="dxa" w:w="5499"/>
+            <w:tcW w:type="dxa" w:w="5698"/>
+            <w:vAlign w:val="center"/>
             <w:tcBorders>
-              <w:top w:val="single" w:sz="10" w:space="0" w:color="229ED9"/>
-              <w:left w:val="single" w:sz="10" w:space="0" w:color="229ED9"/>
-              <w:bottom w:val="single" w:sz="10" w:space="0" w:color="229ED9"/>
-              <w:right w:val="single" w:sz="10" w:space="0" w:color="229ED9"/>
+              <w:top w:val="single" w:sz="12" w:space="0" w:color="229ED9"/>
+              <w:left w:val="single" w:sz="12" w:space="0" w:color="229ED9"/>
+              <w:bottom w:val="single" w:sz="12" w:space="0" w:color="229ED9"/>
+              <w:right w:val="single" w:sz="12" w:space="0" w:color="229ED9"/>
             </w:tcBorders>
           </w:tcPr>
           <w:p>
             <w:pPr>
+              <w:spacing w:before="0" w:after="40" w:line="240" w:lineRule="auto"/>
               <w:jc w:val="center"/>
             </w:pPr>
             <w:r/>
             <w:r>
               <w:rPr>
+                <w:rFonts w:ascii="Arial" w:hAnsi="Arial"/>
                 <w:b/>
                 <w:color w:val="334155"/>
-                <w:sz w:val="15"/>
+                <w:sz w:val="20"/>
               </w:rPr>
               <w:t>Бесплатно · без скачивания</w:t>
             </w:r>
           </w:p>
           <w:p>
             <w:pPr>
+              <w:spacing w:before="0" w:after="40" w:line="240" w:lineRule="auto"/>
               <w:jc w:val="center"/>
             </w:pPr>
             <w:r>
               <w:rPr>
+                <w:rFonts w:ascii="Arial" w:hAnsi="Arial"/>
                 <w:b/>
                 <w:color w:val="229ED9"/>
-                <w:sz w:val="24"/>
+                <w:sz w:val="32"/>
               </w:rPr>
               <w:t>😂 Мемы Амаля</w:t>
             </w:r>
           </w:p>
           <w:p>
             <w:pPr>
+              <w:spacing w:before="0" w:after="60" w:line="240" w:lineRule="auto"/>
               <w:jc w:val="center"/>
             </w:pPr>
             <w:r>
               <w:rPr>
+                <w:rFonts w:ascii="Arial" w:hAnsi="Arial"/>
                 <w:b/>
-                <w:color w:val="334155"/>
-                <w:sz w:val="15"/>
+                <w:color w:val="102018"/>
+                <w:sz w:val="22"/>
               </w:rPr>
-              <w:t>Что случилось дома · смешняшки · новости</w:t>
+              <w:t>Смешняшки · новости · что дома</w:t>
             </w:r>
           </w:p>
           <w:p>
             <w:pPr>
+              <w:spacing w:before="0" w:after="40"/>
               <w:jc w:val="center"/>
             </w:pPr>
             <w:r>
               <w:drawing>
                 <wp:inline xmlns:a="http://schemas.openxmlformats.org/drawingml/2006/main" xmlns:pic="http://schemas.openxmlformats.org/drawingml/2006/picture">
-                  <wp:extent cx="1008000" cy="1008000"/>
+                  <wp:extent cx="1296000" cy="1296000"/>
                   <wp:docPr id="1" name="Picture 1"/>
                   <wp:cNvGraphicFramePr>
                     <a:graphicFrameLocks noChangeAspect="1"/>
@@ -120,7 +104,7 @@
                         <pic:spPr>
                           <a:xfrm>
                             <a:off x="0" y="0"/>
-                            <a:ext cx="1008000" cy="1008000"/>
+                            <a:ext cx="1296000" cy="1296000"/>
                           </a:xfrm>
                           <a:prstGeom prst="rect"/>
                         </pic:spPr>
@@ -133,87 +117,75 @@
           </w:p>
           <w:p>
             <w:pPr>
+              <w:spacing w:before="0" w:after="60" w:line="240" w:lineRule="auto"/>
               <w:jc w:val="center"/>
             </w:pPr>
             <w:r>
               <w:rPr>
+                <w:rFonts w:ascii="Arial" w:hAnsi="Arial"/>
                 <w:b/>
                 <w:color w:val="229ED9"/>
-                <w:sz w:val="17"/>
+                <w:sz w:val="24"/>
               </w:rPr>
               <w:t>📷 Наведи камеру сюда</w:t>
             </w:r>
           </w:p>
           <w:p>
             <w:pPr>
+              <w:spacing w:before="0" w:after="20" w:line="240" w:lineRule="auto"/>
               <w:jc w:val="center"/>
             </w:pPr>
             <w:r>
               <w:rPr>
-                <w:color w:val="64748B"/>
-                <w:sz w:val="11"/>
-              </w:rPr>
-              <w:t>https://alisherxasanov.github.io/amal-games/go-memes.html?v=1</w:t>
-            </w:r>
-          </w:p>
-          <w:p>
-            <w:pPr>
-              <w:jc w:val="center"/>
-            </w:pPr>
-            <w:r>
-              <w:rPr>
+                <w:rFonts w:ascii="Arial" w:hAnsi="Arial"/>
                 <w:b/>
-                <w:sz w:val="13"/>
+                <w:color w:val="102018"/>
+                <w:sz w:val="20"/>
               </w:rPr>
               <w:t>1. Открой камеру на телефоне</w:t>
             </w:r>
           </w:p>
           <w:p>
             <w:pPr>
+              <w:spacing w:before="0" w:after="20" w:line="240" w:lineRule="auto"/>
               <w:jc w:val="center"/>
             </w:pPr>
             <w:r>
               <w:rPr>
+                <w:rFonts w:ascii="Arial" w:hAnsi="Arial"/>
                 <w:b/>
-                <w:sz w:val="13"/>
+                <w:color w:val="102018"/>
+                <w:sz w:val="20"/>
               </w:rPr>
-              <w:t>2. Наведи на QR — нажми ссылку</w:t>
+              <w:t>2. Наведи на QR и нажми ссылку</w:t>
             </w:r>
           </w:p>
           <w:p>
             <w:pPr>
+              <w:spacing w:before="0" w:after="20" w:line="240" w:lineRule="auto"/>
               <w:jc w:val="center"/>
             </w:pPr>
             <w:r>
               <w:rPr>
+                <w:rFonts w:ascii="Arial" w:hAnsi="Arial"/>
                 <w:b/>
-                <w:sz w:val="13"/>
+                <w:color w:val="102018"/>
+                <w:sz w:val="20"/>
               </w:rPr>
-              <w:t>3. Напиши имя и кидай мемы</w:t>
+              <w:t>3. Напиши имя — кидай мемы</w:t>
             </w:r>
           </w:p>
           <w:p>
             <w:pPr>
+              <w:spacing w:before="0" w:after="0" w:line="240" w:lineRule="auto"/>
               <w:jc w:val="center"/>
             </w:pPr>
             <w:r>
               <w:rPr>
-                <w:b/>
-                <w:color w:val="64748B"/>
-                <w:sz w:val="13"/>
-              </w:rPr>
-              <w:t>Один канал для всех</w:t>
-            </w:r>
-          </w:p>
-          <w:p>
-            <w:pPr>
-              <w:jc w:val="center"/>
-            </w:pPr>
-            <w:r>
-              <w:rPr>
+                <w:rFonts w:ascii="Arial" w:hAnsi="Arial"/>
                 <w:b/>
                 <w:color w:val="E25A3C"/>
-                <w:sz w:val="16"/>
+                <w:sz w:val="22"/>
               </w:rPr>
               <w:t>— Амаль ♥</w:t>
             </w:r>
@@ -221,62 +193,70 @@
         </w:tc>
         <w:tc>
           <w:tcPr>
-            <w:tcW w:type="dxa" w:w="5499"/>
+            <w:tcW w:type="dxa" w:w="5698"/>
+            <w:vAlign w:val="center"/>
             <w:tcBorders>
-              <w:top w:val="single" w:sz="10" w:space="0" w:color="229ED9"/>
-              <w:left w:val="single" w:sz="10" w:space="0" w:color="229ED9"/>
-              <w:bottom w:val="single" w:sz="10" w:space="0" w:color="229ED9"/>
-              <w:right w:val="single" w:sz="10" w:space="0" w:color="229ED9"/>
+              <w:top w:val="single" w:sz="12" w:space="0" w:color="229ED9"/>
+              <w:left w:val="single" w:sz="12" w:space="0" w:color="229ED9"/>
+              <w:bottom w:val="single" w:sz="12" w:space="0" w:color="229ED9"/>
+              <w:right w:val="single" w:sz="12" w:space="0" w:color="229ED9"/>
             </w:tcBorders>
           </w:tcPr>
           <w:p>
             <w:pPr>
+              <w:spacing w:before="0" w:after="40" w:line="240" w:lineRule="auto"/>
               <w:jc w:val="center"/>
             </w:pPr>
             <w:r/>
             <w:r>
               <w:rPr>
+                <w:rFonts w:ascii="Arial" w:hAnsi="Arial"/>
                 <w:b/>
                 <w:color w:val="334155"/>
-                <w:sz w:val="15"/>
+                <w:sz w:val="20"/>
               </w:rPr>
               <w:t>Бесплатно · без скачивания</w:t>
             </w:r>
           </w:p>
           <w:p>
             <w:pPr>
+              <w:spacing w:before="0" w:after="40" w:line="240" w:lineRule="auto"/>
               <w:jc w:val="center"/>
             </w:pPr>
             <w:r>
               <w:rPr>
+                <w:rFonts w:ascii="Arial" w:hAnsi="Arial"/>
                 <w:b/>
                 <w:color w:val="229ED9"/>
-                <w:sz w:val="24"/>
+                <w:sz w:val="32"/>
               </w:rPr>
               <w:t>😂 Мемы Амаля</w:t>
             </w:r>
           </w:p>
           <w:p>
             <w:pPr>
+              <w:spacing w:before="0" w:after="60" w:line="240" w:lineRule="auto"/>
               <w:jc w:val="center"/>
             </w:pPr>
             <w:r>
               <w:rPr>
+                <w:rFonts w:ascii="Arial" w:hAnsi="Arial"/>
                 <w:b/>
-                <w:color w:val="334155"/>
-                <w:sz w:val="15"/>
+                <w:color w:val="102018"/>
+                <w:sz w:val="22"/>
               </w:rPr>
-              <w:t>Что случилось дома · смешняшки · новости</w:t>
+              <w:t>Смешняшки · новости · что дома</w:t>
             </w:r>
           </w:p>
           <w:p>
             <w:pPr>
+              <w:spacing w:before="0" w:after="40"/>
               <w:jc w:val="center"/>
             </w:pPr>
             <w:r>
               <w:drawing>
                 <wp:inline xmlns:a="http://schemas.openxmlformats.org/drawingml/2006/main" xmlns:pic="http://schemas.openxmlformats.org/drawingml/2006/picture">
-                  <wp:extent cx="1008000" cy="1008000"/>
+                  <wp:extent cx="1296000" cy="1296000"/>
                   <wp:docPr id="2" name="Picture 2"/>
                   <wp:cNvGraphicFramePr>
                     <a:graphicFrameLocks noChangeAspect="1"/>
@@ -297,7 +277,7 @@
                         <pic:spPr>
                           <a:xfrm>
                             <a:off x="0" y="0"/>
-                            <a:ext cx="1008000" cy="1008000"/>
+                            <a:ext cx="1296000" cy="1296000"/>
                           </a:xfrm>
                           <a:prstGeom prst="rect"/>
                         </pic:spPr>
@@ -310,87 +290,75 @@
           </w:p>
           <w:p>
             <w:pPr>
+              <w:spacing w:before="0" w:after="60" w:line="240" w:lineRule="auto"/>
               <w:jc w:val="center"/>
             </w:pPr>
             <w:r>
               <w:rPr>
+                <w:rFonts w:ascii="Arial" w:hAnsi="Arial"/>
                 <w:b/>
                 <w:color w:val="229ED9"/>
-                <w:sz w:val="17"/>
+                <w:sz w:val="24"/>
               </w:rPr>
               <w:t>📷 Наведи камеру сюда</w:t>
             </w:r>
           </w:p>
           <w:p>
             <w:pPr>
+              <w:spacing w:before="0" w:after="20" w:line="240" w:lineRule="auto"/>
               <w:jc w:val="center"/>
             </w:pPr>
             <w:r>
               <w:rPr>
-                <w:color w:val="64748B"/>
-                <w:sz w:val="11"/>
-              </w:rPr>
-              <w:t>https://alisherxasanov.github.io/amal-games/go-memes.html?v=1</w:t>
-            </w:r>
-          </w:p>
-          <w:p>
-            <w:pPr>
-              <w:jc w:val="center"/>
-            </w:pPr>
-            <w:r>
-              <w:rPr>
+                <w:rFonts w:ascii="Arial" w:hAnsi="Arial"/>
                 <w:b/>
-                <w:sz w:val="13"/>
+                <w:color w:val="102018"/>
+                <w:sz w:val="20"/>
               </w:rPr>
               <w:t>1. Открой камеру на телефоне</w:t>
             </w:r>
           </w:p>
           <w:p>
             <w:pPr>
+              <w:spacing w:before="0" w:after="20" w:line="240" w:lineRule="auto"/>
               <w:jc w:val="center"/>
             </w:pPr>
             <w:r>
               <w:rPr>
+                <w:rFonts w:ascii="Arial" w:hAnsi="Arial"/>
                 <w:b/>
-                <w:sz w:val="13"/>
+                <w:color w:val="102018"/>
+                <w:sz w:val="20"/>
               </w:rPr>
-              <w:t>2. Наведи на QR — нажми ссылку</w:t>
+              <w:t>2. Наведи на QR и нажми ссылку</w:t>
             </w:r>
           </w:p>
           <w:p>
             <w:pPr>
+              <w:spacing w:before="0" w:after="20" w:line="240" w:lineRule="auto"/>
               <w:jc w:val="center"/>
             </w:pPr>
             <w:r>
               <w:rPr>
+                <w:rFonts w:ascii="Arial" w:hAnsi="Arial"/>
                 <w:b/>
-                <w:sz w:val="13"/>
+                <w:color w:val="102018"/>
+                <w:sz w:val="20"/>
               </w:rPr>
-              <w:t>3. Напиши имя и кидай мемы</w:t>
+              <w:t>3. Напиши имя — кидай мемы</w:t>
             </w:r>
           </w:p>
           <w:p>
             <w:pPr>
+              <w:spacing w:before="0" w:after="0" w:line="240" w:lineRule="auto"/>
               <w:jc w:val="center"/>
             </w:pPr>
             <w:r>
               <w:rPr>
-                <w:b/>
-                <w:color w:val="64748B"/>
-                <w:sz w:val="13"/>
-              </w:rPr>
-              <w:t>Один канал для всех</w:t>
-            </w:r>
-          </w:p>
-          <w:p>
-            <w:pPr>
-              <w:jc w:val="center"/>
-            </w:pPr>
-            <w:r>
-              <w:rPr>
+                <w:rFonts w:ascii="Arial" w:hAnsi="Arial"/>
                 <w:b/>
                 <w:color w:val="E25A3C"/>
-                <w:sz w:val="16"/>
+                <w:sz w:val="22"/>
               </w:rPr>
               <w:t>— Амаль ♥</w:t>
             </w:r>
@@ -399,66 +367,75 @@
       </w:tr>
       <w:tr>
         <w:trPr>
-          <w:trHeight w:val="4989"/>
+          <w:cantSplit/>
+          <w:trHeight w:val="5301"/>
         </w:trPr>
         <w:tc>
           <w:tcPr>
-            <w:tcW w:type="dxa" w:w="5499"/>
+            <w:tcW w:type="dxa" w:w="5698"/>
+            <w:vAlign w:val="center"/>
             <w:tcBorders>
-              <w:top w:val="single" w:sz="10" w:space="0" w:color="229ED9"/>
-              <w:left w:val="single" w:sz="10" w:space="0" w:color="229ED9"/>
-              <w:bottom w:val="single" w:sz="10" w:space="0" w:color="229ED9"/>
-              <w:right w:val="single" w:sz="10" w:space="0" w:color="229ED9"/>
+              <w:top w:val="single" w:sz="12" w:space="0" w:color="229ED9"/>
+              <w:left w:val="single" w:sz="12" w:space="0" w:color="229ED9"/>
+              <w:bottom w:val="single" w:sz="12" w:space="0" w:color="229ED9"/>
+              <w:right w:val="single" w:sz="12" w:space="0" w:color="229ED9"/>
             </w:tcBorders>
           </w:tcPr>
           <w:p>
             <w:pPr>
+              <w:spacing w:before="0" w:after="40" w:line="240" w:lineRule="auto"/>
               <w:jc w:val="center"/>
             </w:pPr>
             <w:r/>
             <w:r>
               <w:rPr>
+                <w:rFonts w:ascii="Arial" w:hAnsi="Arial"/>
                 <w:b/>
                 <w:color w:val="334155"/>
-                <w:sz w:val="15"/>
+                <w:sz w:val="20"/>
               </w:rPr>
               <w:t>Бесплатно · без скачивания</w:t>
             </w:r>
           </w:p>
           <w:p>
             <w:pPr>
+              <w:spacing w:before="0" w:after="40" w:line="240" w:lineRule="auto"/>
               <w:jc w:val="center"/>
             </w:pPr>
             <w:r>
               <w:rPr>
+                <w:rFonts w:ascii="Arial" w:hAnsi="Arial"/>
                 <w:b/>
                 <w:color w:val="229ED9"/>
-                <w:sz w:val="24"/>
+                <w:sz w:val="32"/>
               </w:rPr>
               <w:t>😂 Мемы Амаля</w:t>
             </w:r>
           </w:p>
           <w:p>
             <w:pPr>
+              <w:spacing w:before="0" w:after="60" w:line="240" w:lineRule="auto"/>
               <w:jc w:val="center"/>
             </w:pPr>
             <w:r>
               <w:rPr>
+                <w:rFonts w:ascii="Arial" w:hAnsi="Arial"/>
                 <w:b/>
-                <w:color w:val="334155"/>
-                <w:sz w:val="15"/>
+                <w:color w:val="102018"/>
+                <w:sz w:val="22"/>
               </w:rPr>
-              <w:t>Что случилось дома · смешняшки · новости</w:t>
+              <w:t>Смешняшки · новости · что дома</w:t>
             </w:r>
           </w:p>
           <w:p>
             <w:pPr>
+              <w:spacing w:before="0" w:after="40"/>
               <w:jc w:val="center"/>
             </w:pPr>
             <w:r>
               <w:drawing>
                 <wp:inline xmlns:a="http://schemas.openxmlformats.org/drawingml/2006/main" xmlns:pic="http://schemas.openxmlformats.org/drawingml/2006/picture">
-                  <wp:extent cx="1008000" cy="1008000"/>
+                  <wp:extent cx="1296000" cy="1296000"/>
                   <wp:docPr id="3" name="Picture 3"/>
                   <wp:cNvGraphicFramePr>
                     <a:graphicFrameLocks noChangeAspect="1"/>
@@ -479,7 +456,7 @@
                         <pic:spPr>
                           <a:xfrm>
                             <a:off x="0" y="0"/>
-                            <a:ext cx="1008000" cy="1008000"/>
+                            <a:ext cx="1296000" cy="1296000"/>
                           </a:xfrm>
                           <a:prstGeom prst="rect"/>
                         </pic:spPr>
@@ -492,87 +469,75 @@
           </w:p>
           <w:p>
             <w:pPr>
+              <w:spacing w:before="0" w:after="60" w:line="240" w:lineRule="auto"/>
               <w:jc w:val="center"/>
             </w:pPr>
             <w:r>
               <w:rPr>
+                <w:rFonts w:ascii="Arial" w:hAnsi="Arial"/>
                 <w:b/>
                 <w:color w:val="229ED9"/>
-                <w:sz w:val="17"/>
+                <w:sz w:val="24"/>
               </w:rPr>
               <w:t>📷 Наведи камеру сюда</w:t>
             </w:r>
           </w:p>
           <w:p>
             <w:pPr>
+              <w:spacing w:before="0" w:after="20" w:line="240" w:lineRule="auto"/>
               <w:jc w:val="center"/>
             </w:pPr>
             <w:r>
               <w:rPr>
-                <w:color w:val="64748B"/>
-                <w:sz w:val="11"/>
-              </w:rPr>
-              <w:t>https://alisherxasanov.github.io/amal-games/go-memes.html?v=1</w:t>
-            </w:r>
-          </w:p>
-          <w:p>
-            <w:pPr>
-              <w:jc w:val="center"/>
-            </w:pPr>
-            <w:r>
-              <w:rPr>
+                <w:rFonts w:ascii="Arial" w:hAnsi="Arial"/>
                 <w:b/>
-                <w:sz w:val="13"/>
+                <w:color w:val="102018"/>
+                <w:sz w:val="20"/>
               </w:rPr>
               <w:t>1. Открой камеру на телефоне</w:t>
             </w:r>
           </w:p>
           <w:p>
             <w:pPr>
+              <w:spacing w:before="0" w:after="20" w:line="240" w:lineRule="auto"/>
               <w:jc w:val="center"/>
             </w:pPr>
             <w:r>
               <w:rPr>
+                <w:rFonts w:ascii="Arial" w:hAnsi="Arial"/>
                 <w:b/>
-                <w:sz w:val="13"/>
+                <w:color w:val="102018"/>
+                <w:sz w:val="20"/>
               </w:rPr>
-              <w:t>2. Наведи на QR — нажми ссылку</w:t>
+              <w:t>2. Наведи на QR и нажми ссылку</w:t>
             </w:r>
           </w:p>
           <w:p>
             <w:pPr>
+              <w:spacing w:before="0" w:after="20" w:line="240" w:lineRule="auto"/>
               <w:jc w:val="center"/>
             </w:pPr>
             <w:r>
               <w:rPr>
+                <w:rFonts w:ascii="Arial" w:hAnsi="Arial"/>
                 <w:b/>
-                <w:sz w:val="13"/>
+                <w:color w:val="102018"/>
+                <w:sz w:val="20"/>
               </w:rPr>
-              <w:t>3. Напиши имя и кидай мемы</w:t>
+              <w:t>3. Напиши имя — кидай мемы</w:t>
             </w:r>
           </w:p>
           <w:p>
             <w:pPr>
+              <w:spacing w:before="0" w:after="0" w:line="240" w:lineRule="auto"/>
               <w:jc w:val="center"/>
             </w:pPr>
             <w:r>
               <w:rPr>
-                <w:b/>
-                <w:color w:val="64748B"/>
-                <w:sz w:val="13"/>
-              </w:rPr>
-              <w:t>Один канал для всех</w:t>
-            </w:r>
-          </w:p>
-          <w:p>
-            <w:pPr>
-              <w:jc w:val="center"/>
-            </w:pPr>
-            <w:r>
-              <w:rPr>
+                <w:rFonts w:ascii="Arial" w:hAnsi="Arial"/>
                 <w:b/>
                 <w:color w:val="E25A3C"/>
-                <w:sz w:val="16"/>
+                <w:sz w:val="22"/>
               </w:rPr>
               <w:t>— Амаль ♥</w:t>
             </w:r>
@@ -580,62 +545,70 @@
         </w:tc>
         <w:tc>
           <w:tcPr>
-            <w:tcW w:type="dxa" w:w="5499"/>
+            <w:tcW w:type="dxa" w:w="5698"/>
+            <w:vAlign w:val="center"/>
             <w:tcBorders>
-              <w:top w:val="single" w:sz="10" w:space="0" w:color="229ED9"/>
-              <w:left w:val="single" w:sz="10" w:space="0" w:color="229ED9"/>
-              <w:bottom w:val="single" w:sz="10" w:space="0" w:color="229ED9"/>
-              <w:right w:val="single" w:sz="10" w:space="0" w:color="229ED9"/>
+              <w:top w:val="single" w:sz="12" w:space="0" w:color="229ED9"/>
+              <w:left w:val="single" w:sz="12" w:space="0" w:color="229ED9"/>
+              <w:bottom w:val="single" w:sz="12" w:space="0" w:color="229ED9"/>
+              <w:right w:val="single" w:sz="12" w:space="0" w:color="229ED9"/>
             </w:tcBorders>
           </w:tcPr>
           <w:p>
             <w:pPr>
+              <w:spacing w:before="0" w:after="40" w:line="240" w:lineRule="auto"/>
               <w:jc w:val="center"/>
             </w:pPr>
             <w:r/>
             <w:r>
               <w:rPr>
+                <w:rFonts w:ascii="Arial" w:hAnsi="Arial"/>
                 <w:b/>
                 <w:color w:val="334155"/>
-                <w:sz w:val="15"/>
+                <w:sz w:val="20"/>
               </w:rPr>
               <w:t>Бесплатно · без скачивания</w:t>
             </w:r>
           </w:p>
           <w:p>
             <w:pPr>
+              <w:spacing w:before="0" w:after="40" w:line="240" w:lineRule="auto"/>
               <w:jc w:val="center"/>
             </w:pPr>
             <w:r>
               <w:rPr>
+                <w:rFonts w:ascii="Arial" w:hAnsi="Arial"/>
                 <w:b/>
                 <w:color w:val="229ED9"/>
-                <w:sz w:val="24"/>
+                <w:sz w:val="32"/>
               </w:rPr>
               <w:t>😂 Мемы Амаля</w:t>
             </w:r>
           </w:p>
           <w:p>
             <w:pPr>
+              <w:spacing w:before="0" w:after="60" w:line="240" w:lineRule="auto"/>
               <w:jc w:val="center"/>
             </w:pPr>
             <w:r>
               <w:rPr>
+                <w:rFonts w:ascii="Arial" w:hAnsi="Arial"/>
                 <w:b/>
-                <w:color w:val="334155"/>
-                <w:sz w:val="15"/>
+                <w:color w:val="102018"/>
+                <w:sz w:val="22"/>
               </w:rPr>
-              <w:t>Что случилось дома · смешняшки · новости</w:t>
+              <w:t>Смешняшки · новости · что дома</w:t>
             </w:r>
           </w:p>
           <w:p>
             <w:pPr>
+              <w:spacing w:before="0" w:after="40"/>
               <w:jc w:val="center"/>
             </w:pPr>
             <w:r>
               <w:drawing>
                 <wp:inline xmlns:a="http://schemas.openxmlformats.org/drawingml/2006/main" xmlns:pic="http://schemas.openxmlformats.org/drawingml/2006/picture">
-                  <wp:extent cx="1008000" cy="1008000"/>
+                  <wp:extent cx="1296000" cy="1296000"/>
                   <wp:docPr id="4" name="Picture 4"/>
                   <wp:cNvGraphicFramePr>
                     <a:graphicFrameLocks noChangeAspect="1"/>
@@ -656,7 +629,7 @@
                         <pic:spPr>
                           <a:xfrm>
                             <a:off x="0" y="0"/>
-                            <a:ext cx="1008000" cy="1008000"/>
+                            <a:ext cx="1296000" cy="1296000"/>
                           </a:xfrm>
                           <a:prstGeom prst="rect"/>
                         </pic:spPr>
@@ -669,87 +642,75 @@
           </w:p>
           <w:p>
             <w:pPr>
+              <w:spacing w:before="0" w:after="60" w:line="240" w:lineRule="auto"/>
               <w:jc w:val="center"/>
             </w:pPr>
             <w:r>
               <w:rPr>
+                <w:rFonts w:ascii="Arial" w:hAnsi="Arial"/>
                 <w:b/>
                 <w:color w:val="229ED9"/>
-                <w:sz w:val="17"/>
+                <w:sz w:val="24"/>
               </w:rPr>
               <w:t>📷 Наведи камеру сюда</w:t>
             </w:r>
           </w:p>
           <w:p>
             <w:pPr>
+              <w:spacing w:before="0" w:after="20" w:line="240" w:lineRule="auto"/>
               <w:jc w:val="center"/>
             </w:pPr>
             <w:r>
               <w:rPr>
-                <w:color w:val="64748B"/>
-                <w:sz w:val="11"/>
-              </w:rPr>
-              <w:t>https://alisherxasanov.github.io/amal-games/go-memes.html?v=1</w:t>
-            </w:r>
-          </w:p>
-          <w:p>
-            <w:pPr>
-              <w:jc w:val="center"/>
-            </w:pPr>
-            <w:r>
-              <w:rPr>
+                <w:rFonts w:ascii="Arial" w:hAnsi="Arial"/>
                 <w:b/>
-                <w:sz w:val="13"/>
+                <w:color w:val="102018"/>
+                <w:sz w:val="20"/>
               </w:rPr>
               <w:t>1. Открой камеру на телефоне</w:t>
             </w:r>
           </w:p>
           <w:p>
             <w:pPr>
+              <w:spacing w:before="0" w:after="20" w:line="240" w:lineRule="auto"/>
               <w:jc w:val="center"/>
             </w:pPr>
             <w:r>
               <w:rPr>
+                <w:rFonts w:ascii="Arial" w:hAnsi="Arial"/>
                 <w:b/>
-                <w:sz w:val="13"/>
+                <w:color w:val="102018"/>
+                <w:sz w:val="20"/>
               </w:rPr>
-              <w:t>2. Наведи на QR — нажми ссылку</w:t>
+              <w:t>2. Наведи на QR и нажми ссылку</w:t>
             </w:r>
           </w:p>
           <w:p>
             <w:pPr>
+              <w:spacing w:before="0" w:after="20" w:line="240" w:lineRule="auto"/>
               <w:jc w:val="center"/>
             </w:pPr>
             <w:r>
               <w:rPr>
+                <w:rFonts w:ascii="Arial" w:hAnsi="Arial"/>
                 <w:b/>
-                <w:sz w:val="13"/>
+                <w:color w:val="102018"/>
+                <w:sz w:val="20"/>
               </w:rPr>
-              <w:t>3. Напиши имя и кидай мемы</w:t>
+              <w:t>3. Напиши имя — кидай мемы</w:t>
             </w:r>
           </w:p>
           <w:p>
             <w:pPr>
+              <w:spacing w:before="0" w:after="0" w:line="240" w:lineRule="auto"/>
               <w:jc w:val="center"/>
             </w:pPr>
             <w:r>
               <w:rPr>
-                <w:b/>
-                <w:color w:val="64748B"/>
-                <w:sz w:val="13"/>
-              </w:rPr>
-              <w:t>Один канал для всех</w:t>
-            </w:r>
-          </w:p>
-          <w:p>
-            <w:pPr>
-              <w:jc w:val="center"/>
-            </w:pPr>
-            <w:r>
-              <w:rPr>
+                <w:rFonts w:ascii="Arial" w:hAnsi="Arial"/>
                 <w:b/>
                 <w:color w:val="E25A3C"/>
-                <w:sz w:val="16"/>
+                <w:sz w:val="22"/>
               </w:rPr>
               <w:t>— Амаль ♥</w:t>
             </w:r>
@@ -758,66 +719,75 @@
       </w:tr>
       <w:tr>
         <w:trPr>
-          <w:trHeight w:val="4989"/>
+          <w:cantSplit/>
+          <w:trHeight w:val="5301"/>
         </w:trPr>
         <w:tc>
           <w:tcPr>
-            <w:tcW w:type="dxa" w:w="5499"/>
+            <w:tcW w:type="dxa" w:w="5698"/>
+            <w:vAlign w:val="center"/>
             <w:tcBorders>
-              <w:top w:val="single" w:sz="10" w:space="0" w:color="229ED9"/>
-              <w:left w:val="single" w:sz="10" w:space="0" w:color="229ED9"/>
-              <w:bottom w:val="single" w:sz="10" w:space="0" w:color="229ED9"/>
-              <w:right w:val="single" w:sz="10" w:space="0" w:color="229ED9"/>
+              <w:top w:val="single" w:sz="12" w:space="0" w:color="229ED9"/>
+              <w:left w:val="single" w:sz="12" w:space="0" w:color="229ED9"/>
+              <w:bottom w:val="single" w:sz="12" w:space="0" w:color="229ED9"/>
+              <w:right w:val="single" w:sz="12" w:space="0" w:color="229ED9"/>
             </w:tcBorders>
           </w:tcPr>
           <w:p>
             <w:pPr>
+              <w:spacing w:before="0" w:after="40" w:line="240" w:lineRule="auto"/>
               <w:jc w:val="center"/>
             </w:pPr>
             <w:r/>
             <w:r>
               <w:rPr>
+                <w:rFonts w:ascii="Arial" w:hAnsi="Arial"/>
                 <w:b/>
                 <w:color w:val="334155"/>
-                <w:sz w:val="15"/>
+                <w:sz w:val="20"/>
               </w:rPr>
               <w:t>Бесплатно · без скачивания</w:t>
             </w:r>
           </w:p>
           <w:p>
             <w:pPr>
+              <w:spacing w:before="0" w:after="40" w:line="240" w:lineRule="auto"/>
               <w:jc w:val="center"/>
             </w:pPr>
             <w:r>
               <w:rPr>
+                <w:rFonts w:ascii="Arial" w:hAnsi="Arial"/>
                 <w:b/>
                 <w:color w:val="229ED9"/>
-                <w:sz w:val="24"/>
+                <w:sz w:val="32"/>
               </w:rPr>
               <w:t>😂 Мемы Амаля</w:t>
             </w:r>
           </w:p>
           <w:p>
             <w:pPr>
+              <w:spacing w:before="0" w:after="60" w:line="240" w:lineRule="auto"/>
               <w:jc w:val="center"/>
             </w:pPr>
             <w:r>
               <w:rPr>
+                <w:rFonts w:ascii="Arial" w:hAnsi="Arial"/>
                 <w:b/>
-                <w:color w:val="334155"/>
-                <w:sz w:val="15"/>
+                <w:color w:val="102018"/>
+                <w:sz w:val="22"/>
               </w:rPr>
-              <w:t>Что случилось дома · смешняшки · новости</w:t>
+              <w:t>Смешняшки · новости · что дома</w:t>
             </w:r>
           </w:p>
           <w:p>
             <w:pPr>
+              <w:spacing w:before="0" w:after="40"/>
               <w:jc w:val="center"/>
             </w:pPr>
             <w:r>
               <w:drawing>
                 <wp:inline xmlns:a="http://schemas.openxmlformats.org/drawingml/2006/main" xmlns:pic="http://schemas.openxmlformats.org/drawingml/2006/picture">
-                  <wp:extent cx="1008000" cy="1008000"/>
+                  <wp:extent cx="1296000" cy="1296000"/>
                   <wp:docPr id="5" name="Picture 5"/>
                   <wp:cNvGraphicFramePr>
                     <a:graphicFrameLocks noChangeAspect="1"/>
@@ -838,7 +808,7 @@
                         <pic:spPr>
                           <a:xfrm>
                             <a:off x="0" y="0"/>
-                            <a:ext cx="1008000" cy="1008000"/>
+                            <a:ext cx="1296000" cy="1296000"/>
                           </a:xfrm>
                           <a:prstGeom prst="rect"/>
                         </pic:spPr>
@@ -851,87 +821,75 @@
           </w:p>
           <w:p>
             <w:pPr>
+              <w:spacing w:before="0" w:after="60" w:line="240" w:lineRule="auto"/>
               <w:jc w:val="center"/>
             </w:pPr>
             <w:r>
               <w:rPr>
+                <w:rFonts w:ascii="Arial" w:hAnsi="Arial"/>
                 <w:b/>
                 <w:color w:val="229ED9"/>
-                <w:sz w:val="17"/>
+                <w:sz w:val="24"/>
               </w:rPr>
               <w:t>📷 Наведи камеру сюда</w:t>
             </w:r>
           </w:p>
           <w:p>
             <w:pPr>
+              <w:spacing w:before="0" w:after="20" w:line="240" w:lineRule="auto"/>
               <w:jc w:val="center"/>
             </w:pPr>
             <w:r>
               <w:rPr>
-                <w:color w:val="64748B"/>
-                <w:sz w:val="11"/>
-              </w:rPr>
-              <w:t>https://alisherxasanov.github.io/amal-games/go-memes.html?v=1</w:t>
-            </w:r>
-          </w:p>
-          <w:p>
-            <w:pPr>
-              <w:jc w:val="center"/>
-            </w:pPr>
-            <w:r>
-              <w:rPr>
+                <w:rFonts w:ascii="Arial" w:hAnsi="Arial"/>
                 <w:b/>
-                <w:sz w:val="13"/>
+                <w:color w:val="102018"/>
+                <w:sz w:val="20"/>
               </w:rPr>
               <w:t>1. Открой камеру на телефоне</w:t>
             </w:r>
           </w:p>
           <w:p>
             <w:pPr>
+              <w:spacing w:before="0" w:after="20" w:line="240" w:lineRule="auto"/>
               <w:jc w:val="center"/>
             </w:pPr>
             <w:r>
               <w:rPr>
+                <w:rFonts w:ascii="Arial" w:hAnsi="Arial"/>
                 <w:b/>
-                <w:sz w:val="13"/>
+                <w:color w:val="102018"/>
+                <w:sz w:val="20"/>
               </w:rPr>
-              <w:t>2. Наведи на QR — нажми ссылку</w:t>
+              <w:t>2. Наведи на QR и нажми ссылку</w:t>
             </w:r>
           </w:p>
           <w:p>
             <w:pPr>
+              <w:spacing w:before="0" w:after="20" w:line="240" w:lineRule="auto"/>
               <w:jc w:val="center"/>
             </w:pPr>
             <w:r>
               <w:rPr>
+                <w:rFonts w:ascii="Arial" w:hAnsi="Arial"/>
                 <w:b/>
-                <w:sz w:val="13"/>
+                <w:color w:val="102018"/>
+                <w:sz w:val="20"/>
               </w:rPr>
-              <w:t>3. Напиши имя и кидай мемы</w:t>
+              <w:t>3. Напиши имя — кидай мемы</w:t>
             </w:r>
           </w:p>
           <w:p>
             <w:pPr>
+              <w:spacing w:before="0" w:after="0" w:line="240" w:lineRule="auto"/>
               <w:jc w:val="center"/>
             </w:pPr>
             <w:r>
               <w:rPr>
-                <w:b/>
-                <w:color w:val="64748B"/>
-                <w:sz w:val="13"/>
-              </w:rPr>
-              <w:t>Один канал для всех</w:t>
-            </w:r>
-          </w:p>
-          <w:p>
-            <w:pPr>
-              <w:jc w:val="center"/>
-            </w:pPr>
-            <w:r>
-              <w:rPr>
+                <w:rFonts w:ascii="Arial" w:hAnsi="Arial"/>
                 <w:b/>
                 <w:color w:val="E25A3C"/>
-                <w:sz w:val="16"/>
+                <w:sz w:val="22"/>
               </w:rPr>
               <w:t>— Амаль ♥</w:t>
             </w:r>
@@ -939,62 +897,70 @@
         </w:tc>
         <w:tc>
           <w:tcPr>
-            <w:tcW w:type="dxa" w:w="5499"/>
+            <w:tcW w:type="dxa" w:w="5698"/>
+            <w:vAlign w:val="center"/>
             <w:tcBorders>
-              <w:top w:val="single" w:sz="10" w:space="0" w:color="229ED9"/>
-              <w:left w:val="single" w:sz="10" w:space="0" w:color="229ED9"/>
-              <w:bottom w:val="single" w:sz="10" w:space="0" w:color="229ED9"/>
-              <w:right w:val="single" w:sz="10" w:space="0" w:color="229ED9"/>
+              <w:top w:val="single" w:sz="12" w:space="0" w:color="229ED9"/>
+              <w:left w:val="single" w:sz="12" w:space="0" w:color="229ED9"/>
+              <w:bottom w:val="single" w:sz="12" w:space="0" w:color="229ED9"/>
+              <w:right w:val="single" w:sz="12" w:space="0" w:color="229ED9"/>
             </w:tcBorders>
           </w:tcPr>
           <w:p>
             <w:pPr>
+              <w:spacing w:before="0" w:after="40" w:line="240" w:lineRule="auto"/>
               <w:jc w:val="center"/>
             </w:pPr>
             <w:r/>
             <w:r>
               <w:rPr>
+                <w:rFonts w:ascii="Arial" w:hAnsi="Arial"/>
                 <w:b/>
                 <w:color w:val="334155"/>
-                <w:sz w:val="15"/>
+                <w:sz w:val="20"/>
               </w:rPr>
               <w:t>Бесплатно · без скачивания</w:t>
             </w:r>
           </w:p>
           <w:p>
             <w:pPr>
+              <w:spacing w:before="0" w:after="40" w:line="240" w:lineRule="auto"/>
               <w:jc w:val="center"/>
             </w:pPr>
             <w:r>
               <w:rPr>
+                <w:rFonts w:ascii="Arial" w:hAnsi="Arial"/>
                 <w:b/>
                 <w:color w:val="229ED9"/>
-                <w:sz w:val="24"/>
+                <w:sz w:val="32"/>
               </w:rPr>
               <w:t>😂 Мемы Амаля</w:t>
             </w:r>
           </w:p>
           <w:p>
             <w:pPr>
+              <w:spacing w:before="0" w:after="60" w:line="240" w:lineRule="auto"/>
               <w:jc w:val="center"/>
             </w:pPr>
             <w:r>
               <w:rPr>
+                <w:rFonts w:ascii="Arial" w:hAnsi="Arial"/>
                 <w:b/>
-                <w:color w:val="334155"/>
-                <w:sz w:val="15"/>
+                <w:color w:val="102018"/>
+                <w:sz w:val="22"/>
               </w:rPr>
-              <w:t>Что случилось дома · смешняшки · новости</w:t>
+              <w:t>Смешняшки · новости · что дома</w:t>
             </w:r>
           </w:p>
           <w:p>
             <w:pPr>
+              <w:spacing w:before="0" w:after="40"/>
               <w:jc w:val="center"/>
             </w:pPr>
             <w:r>
               <w:drawing>
                 <wp:inline xmlns:a="http://schemas.openxmlformats.org/drawingml/2006/main" xmlns:pic="http://schemas.openxmlformats.org/drawingml/2006/picture">
-                  <wp:extent cx="1008000" cy="1008000"/>
+                  <wp:extent cx="1296000" cy="1296000"/>
                   <wp:docPr id="6" name="Picture 6"/>
                   <wp:cNvGraphicFramePr>
                     <a:graphicFrameLocks noChangeAspect="1"/>
@@ -1015,7 +981,7 @@
                         <pic:spPr>
                           <a:xfrm>
                             <a:off x="0" y="0"/>
-                            <a:ext cx="1008000" cy="1008000"/>
+                            <a:ext cx="1296000" cy="1296000"/>
                           </a:xfrm>
                           <a:prstGeom prst="rect"/>
                         </pic:spPr>
@@ -1028,87 +994,75 @@
           </w:p>
           <w:p>
             <w:pPr>
+              <w:spacing w:before="0" w:after="60" w:line="240" w:lineRule="auto"/>
               <w:jc w:val="center"/>
             </w:pPr>
             <w:r>
               <w:rPr>
+                <w:rFonts w:ascii="Arial" w:hAnsi="Arial"/>
                 <w:b/>
                 <w:color w:val="229ED9"/>
-                <w:sz w:val="17"/>
+                <w:sz w:val="24"/>
               </w:rPr>
               <w:t>📷 Наведи камеру сюда</w:t>
             </w:r>
           </w:p>
           <w:p>
             <w:pPr>
+              <w:spacing w:before="0" w:after="20" w:line="240" w:lineRule="auto"/>
               <w:jc w:val="center"/>
             </w:pPr>
             <w:r>
               <w:rPr>
-                <w:color w:val="64748B"/>
-                <w:sz w:val="11"/>
-              </w:rPr>
-              <w:t>https://alisherxasanov.github.io/amal-games/go-memes.html?v=1</w:t>
-            </w:r>
-          </w:p>
-          <w:p>
-            <w:pPr>
-              <w:jc w:val="center"/>
-            </w:pPr>
-            <w:r>
-              <w:rPr>
+                <w:rFonts w:ascii="Arial" w:hAnsi="Arial"/>
                 <w:b/>
-                <w:sz w:val="13"/>
+                <w:color w:val="102018"/>
+                <w:sz w:val="20"/>
               </w:rPr>
               <w:t>1. Открой камеру на телефоне</w:t>
             </w:r>
           </w:p>
           <w:p>
             <w:pPr>
+              <w:spacing w:before="0" w:after="20" w:line="240" w:lineRule="auto"/>
               <w:jc w:val="center"/>
             </w:pPr>
             <w:r>
               <w:rPr>
+                <w:rFonts w:ascii="Arial" w:hAnsi="Arial"/>
                 <w:b/>
-                <w:sz w:val="13"/>
+                <w:color w:val="102018"/>
+                <w:sz w:val="20"/>
               </w:rPr>
-              <w:t>2. Наведи на QR — нажми ссылку</w:t>
+              <w:t>2. Наведи на QR и нажми ссылку</w:t>
             </w:r>
           </w:p>
           <w:p>
             <w:pPr>
+              <w:spacing w:before="0" w:after="20" w:line="240" w:lineRule="auto"/>
               <w:jc w:val="center"/>
             </w:pPr>
             <w:r>
               <w:rPr>
+                <w:rFonts w:ascii="Arial" w:hAnsi="Arial"/>
                 <w:b/>
-                <w:sz w:val="13"/>
+                <w:color w:val="102018"/>
+                <w:sz w:val="20"/>
               </w:rPr>
-              <w:t>3. Напиши имя и кидай мемы</w:t>
+              <w:t>3. Напиши имя — кидай мемы</w:t>
             </w:r>
           </w:p>
           <w:p>
             <w:pPr>
+              <w:spacing w:before="0" w:after="0" w:line="240" w:lineRule="auto"/>
               <w:jc w:val="center"/>
             </w:pPr>
             <w:r>
               <w:rPr>
-                <w:b/>
-                <w:color w:val="64748B"/>
-                <w:sz w:val="13"/>
-              </w:rPr>
-              <w:t>Один канал для всех</w:t>
-            </w:r>
-          </w:p>
-          <w:p>
-            <w:pPr>
-              <w:jc w:val="center"/>
-            </w:pPr>
-            <w:r>
-              <w:rPr>
+                <w:rFonts w:ascii="Arial" w:hAnsi="Arial"/>
                 <w:b/>
                 <w:color w:val="E25A3C"/>
-                <w:sz w:val="16"/>
+                <w:sz w:val="22"/>
               </w:rPr>
               <w:t>— Амаль ♥</w:t>
             </w:r>
@@ -1116,21 +1070,9 @@
         </w:tc>
       </w:tr>
     </w:tbl>
-    <w:p>
-      <w:pPr>
-        <w:jc w:val="center"/>
-      </w:pPr>
-      <w:r>
-        <w:rPr>
-          <w:b/>
-          <w:sz w:val="16"/>
-        </w:rPr>
-        <w:t>💻 На компьютере: Игры Амаля → Сканер QR</w:t>
-      </w:r>
-    </w:p>
     <w:sectPr>
       <w:pgSz w:w="11906" w:h="16838"/>
-      <w:pgMar w:top="454" w:right="454" w:bottom="454" w:left="454" w:header="720" w:footer="720" w:gutter="0"/>
+      <w:pgMar w:top="255" w:right="255" w:bottom="255" w:left="255" w:header="720" w:footer="720" w:gutter="0"/>
       <w:cols w:space="720"/>
       <w:docGrid w:linePitch="360"/>
     </w:sectPr>

</xml_diff>